<commit_message>
Update README with TASK-4 live demo link and project details
</commit_message>
<xml_diff>
--- a/TASK-4/TASK-4_Final_Report.docx
+++ b/TASK-4/TASK-4_Final_Report.docx
@@ -82,6 +82,29 @@
             <w:u w:val="single"/>
           </w:rPr>
           <w:t>Groq API</w:t>
+        </w:r>
+      </w:hyperlink>
+    </w:p>
+    <w:p>
+      <w:r>
+        <w:t xml:space="preserve">🚀 </w:t>
+      </w:r>
+      <w:r>
+        <w:rPr>
+          <w:b/>
+        </w:rPr>
+        <w:t>Live Demo:</w:t>
+      </w:r>
+      <w:r>
+        <w:t xml:space="preserve"> </w:t>
+      </w:r>
+      <w:hyperlink r:id="rId15">
+        <w:r>
+          <w:rPr>
+            <w:color w:val="0000EE"/>
+            <w:u w:val="single"/>
+          </w:rPr>
+          <w:t>Spark AI Chatbot</w:t>
         </w:r>
       </w:hyperlink>
     </w:p>
@@ -663,6 +686,261 @@
         <w:t>&lt;!-- Deployment Timestamp: 2026-07-20 11:02:01 --&gt;</w:t>
       </w:r>
     </w:p>
+    <w:p>
+      <w:pPr>
+        <w:pStyle w:val="Heading2"/>
+      </w:pPr>
+      <w:r>
+        <w:t>🐳 Docker &amp; Deployment Details</w:t>
+      </w:r>
+    </w:p>
+    <w:p>
+      <w:pPr>
+        <w:pStyle w:val="Heading3"/>
+      </w:pPr>
+      <w:r>
+        <w:t>Backend Dockerfile (`backend/Dockerfile`)</w:t>
+      </w:r>
+    </w:p>
+    <w:p>
+      <w:pPr>
+        <w:shd w:fill="F0F0F0"/>
+      </w:pPr>
+      <w:r>
+        <w:rPr>
+          <w:rFonts w:ascii="Consolas" w:hAnsi="Consolas"/>
+          <w:sz w:val="18"/>
+        </w:rPr>
+        <w:t># Build Stage</w:t>
+        <w:br/>
+        <w:t>FROM maven:3.9.6-eclipse-temurin-21 AS build</w:t>
+        <w:br/>
+        <w:t>WORKDIR /app</w:t>
+        <w:br/>
+        <w:t>COPY pom.xml ./</w:t>
+        <w:br/>
+        <w:t># Download dependencies (this layer will be cached unless pom.xml changes)</w:t>
+        <w:br/>
+        <w:t>RUN mvn dependency:go-offline -B</w:t>
+        <w:br/>
+        <w:t>COPY src ./src</w:t>
+        <w:br/>
+        <w:t># Build the application</w:t>
+        <w:br/>
+        <w:t>RUN mvn clean package -DskipTests -B</w:t>
+        <w:br/>
+        <w:br/>
+        <w:t># Run Stage</w:t>
+        <w:br/>
+        <w:t>FROM eclipse-temurin:21-jre-jammy</w:t>
+        <w:br/>
+        <w:t>WORKDIR /app</w:t>
+        <w:br/>
+        <w:t>COPY --from=build /app/target/*.jar app.jar</w:t>
+        <w:br/>
+        <w:t>EXPOSE 8080</w:t>
+        <w:br/>
+        <w:t>ENTRYPOINT ["java", "-jar", "app.jar"]</w:t>
+        <w:br/>
+        <w:noProof/>
+      </w:r>
+    </w:p>
+    <w:p>
+      <w:pPr>
+        <w:pStyle w:val="Heading3"/>
+      </w:pPr>
+      <w:r>
+        <w:t>Frontend Dockerfile (`frontend/Dockerfile`)</w:t>
+      </w:r>
+    </w:p>
+    <w:p>
+      <w:pPr>
+        <w:shd w:fill="F0F0F0"/>
+      </w:pPr>
+      <w:r>
+        <w:rPr>
+          <w:rFonts w:ascii="Consolas" w:hAnsi="Consolas"/>
+          <w:sz w:val="18"/>
+        </w:rPr>
+        <w:t>FROM node:20-alpine AS builder</w:t>
+        <w:br/>
+        <w:t>WORKDIR /app</w:t>
+        <w:br/>
+        <w:t>COPY package*.json ./</w:t>
+        <w:br/>
+        <w:t>RUN npm install</w:t>
+        <w:br/>
+        <w:t>COPY . .</w:t>
+        <w:br/>
+        <w:t>RUN npm run build</w:t>
+        <w:br/>
+        <w:br/>
+        <w:t>FROM nginx:alpine</w:t>
+        <w:br/>
+        <w:t>COPY --from=builder /app/dist /usr/share/nginx/html</w:t>
+        <w:br/>
+        <w:t>COPY nginx.conf /etc/nginx/conf.d/default.conf</w:t>
+        <w:br/>
+        <w:t>EXPOSE 80</w:t>
+        <w:br/>
+        <w:t>CMD ["nginx", "-g", "daemon off;"]</w:t>
+        <w:br/>
+        <w:noProof/>
+      </w:r>
+    </w:p>
+    <w:p>
+      <w:pPr>
+        <w:pStyle w:val="Heading3"/>
+      </w:pPr>
+      <w:r>
+        <w:t>Docker Compose (`docker-compose.yml`)</w:t>
+      </w:r>
+    </w:p>
+    <w:p>
+      <w:pPr>
+        <w:shd w:fill="F0F0F0"/>
+      </w:pPr>
+      <w:r>
+        <w:rPr>
+          <w:rFonts w:ascii="Consolas" w:hAnsi="Consolas"/>
+          <w:sz w:val="18"/>
+        </w:rPr>
+        <w:t>version: '3.8'</w:t>
+        <w:br/>
+        <w:br/>
+        <w:t>services:</w:t>
+        <w:br/>
+        <w:t xml:space="preserve">  backend:</w:t>
+        <w:br/>
+        <w:t xml:space="preserve">    build: </w:t>
+        <w:br/>
+        <w:t xml:space="preserve">      context: ./backend</w:t>
+        <w:br/>
+        <w:t xml:space="preserve">      dockerfile: Dockerfile</w:t>
+        <w:br/>
+        <w:t xml:space="preserve">    ports:</w:t>
+        <w:br/>
+        <w:t xml:space="preserve">      - "8080:8080"</w:t>
+        <w:br/>
+        <w:t xml:space="preserve">    environment:</w:t>
+        <w:br/>
+        <w:t xml:space="preserve">      - SPRING_PROFILES_ACTIVE=prod</w:t>
+        <w:br/>
+        <w:t xml:space="preserve">      - DATABASE_URL=jdbc:postgresql://postgres:5432/sparkai</w:t>
+        <w:br/>
+        <w:t xml:space="preserve">      - DATABASE_USERNAME=postgres</w:t>
+        <w:br/>
+        <w:t xml:space="preserve">      - DATABASE_PASSWORD=postgres</w:t>
+        <w:br/>
+        <w:t xml:space="preserve">      - JWT_SECRET=your_super_secret_jwt_key_that_is_at_least_256_bits_long</w:t>
+        <w:br/>
+        <w:t xml:space="preserve">      - GROQ_API_KEY=${GROQ_API_KEY}</w:t>
+        <w:br/>
+        <w:t xml:space="preserve">      - FRONTEND_URL=http://localhost:5173</w:t>
+        <w:br/>
+        <w:t xml:space="preserve">    depends_on:</w:t>
+        <w:br/>
+        <w:t xml:space="preserve">      - postgres</w:t>
+        <w:br/>
+        <w:t xml:space="preserve">    restart: unless-stopped</w:t>
+        <w:br/>
+        <w:br/>
+        <w:t xml:space="preserve">  postgres:</w:t>
+        <w:br/>
+        <w:t xml:space="preserve">    image: postgres:15-alpine</w:t>
+        <w:br/>
+        <w:t xml:space="preserve">    environment:</w:t>
+        <w:br/>
+        <w:t xml:space="preserve">      - POSTGRES_DB=sparkai</w:t>
+        <w:br/>
+        <w:t xml:space="preserve">      - POSTGRES_USER=postgres</w:t>
+        <w:br/>
+        <w:t xml:space="preserve">      - POSTGRES_PASSWORD=postgres</w:t>
+        <w:br/>
+        <w:t xml:space="preserve">    ports:</w:t>
+        <w:br/>
+        <w:t xml:space="preserve">      - "5432:5432"</w:t>
+        <w:br/>
+        <w:t xml:space="preserve">    volumes:</w:t>
+        <w:br/>
+        <w:t xml:space="preserve">      - postgres_data:/var/lib/postgresql/data</w:t>
+        <w:br/>
+        <w:t xml:space="preserve">    restart: unless-stopped</w:t>
+        <w:br/>
+        <w:br/>
+        <w:t>volumes:</w:t>
+        <w:br/>
+        <w:t xml:space="preserve">  postgres_data:</w:t>
+        <w:br/>
+        <w:noProof/>
+      </w:r>
+    </w:p>
+    <w:p>
+      <w:pPr>
+        <w:pStyle w:val="Heading3"/>
+      </w:pPr>
+      <w:r>
+        <w:t>Render Deployment Configuration (`render.yaml`)</w:t>
+      </w:r>
+    </w:p>
+    <w:p>
+      <w:pPr>
+        <w:shd w:fill="F0F0F0"/>
+      </w:pPr>
+      <w:r>
+        <w:rPr>
+          <w:rFonts w:ascii="Consolas" w:hAnsi="Consolas"/>
+          <w:sz w:val="18"/>
+        </w:rPr>
+        <w:t>services:</w:t>
+        <w:br/>
+        <w:t xml:space="preserve">  - type: web</w:t>
+        <w:br/>
+        <w:t xml:space="preserve">    name: ai-chatbot-backend</w:t>
+        <w:br/>
+        <w:t xml:space="preserve">    env: docker</w:t>
+        <w:br/>
+        <w:t xml:space="preserve">    rootDir: TASK-4/backend</w:t>
+        <w:br/>
+        <w:t xml:space="preserve">    dockerfilePath: Dockerfile</w:t>
+        <w:br/>
+        <w:t xml:space="preserve">    plan: free</w:t>
+        <w:br/>
+        <w:t xml:space="preserve">    region: ohio</w:t>
+        <w:br/>
+        <w:t xml:space="preserve">    envVars:</w:t>
+        <w:br/>
+        <w:t xml:space="preserve">      - key: SPRING_PROFILES_ACTIVE</w:t>
+        <w:br/>
+        <w:t xml:space="preserve">        value: prod</w:t>
+        <w:br/>
+        <w:t xml:space="preserve">      - key: DATABASE_URL</w:t>
+        <w:br/>
+        <w:t xml:space="preserve">        sync: false</w:t>
+        <w:br/>
+        <w:t xml:space="preserve">      - key: DATABASE_USERNAME</w:t>
+        <w:br/>
+        <w:t xml:space="preserve">        sync: false</w:t>
+        <w:br/>
+        <w:t xml:space="preserve">      - key: DATABASE_PASSWORD</w:t>
+        <w:br/>
+        <w:t xml:space="preserve">        sync: false</w:t>
+        <w:br/>
+        <w:t xml:space="preserve">      - key: GROQ_API_KEY</w:t>
+        <w:br/>
+        <w:t xml:space="preserve">        sync: false</w:t>
+        <w:br/>
+        <w:t xml:space="preserve">      - key: JWT_SECRET</w:t>
+        <w:br/>
+        <w:t xml:space="preserve">        sync: false</w:t>
+        <w:br/>
+        <w:t xml:space="preserve">      - key: FRONTEND_URL</w:t>
+        <w:br/>
+        <w:t xml:space="preserve">        sync: false</w:t>
+        <w:br/>
+        <w:noProof/>
+      </w:r>
+    </w:p>
     <w:sectPr>
       <w:pgSz w:w="12240" w:h="15840"/>
       <w:pgMar w:top="1440" w:right="1800" w:bottom="1440" w:left="1800" w:header="720" w:footer="720" w:gutter="0"/>

</xml_diff>